<commit_message>
Times new Roman format applied to document
</commit_message>
<xml_diff>
--- a/PreSubmission Document.docx
+++ b/PreSubmission Document.docx
@@ -925,12 +925,14 @@
           <w:numId w:val="12"/>
         </w:numPr>
         <w:rPr>
-          <w:sz w:val="22"/>
-          <w:szCs w:val="22"/>
-        </w:rPr>
-      </w:pPr>
-      <w:r>
-        <w:rPr>
+          <w:rFonts w:ascii="Times New Roman" w:hAnsi="Times New Roman" w:cs="Times New Roman"/>
+          <w:sz w:val="22"/>
+          <w:szCs w:val="22"/>
+        </w:rPr>
+      </w:pPr>
+      <w:r>
+        <w:rPr>
+          <w:rFonts w:ascii="Times New Roman" w:hAnsi="Times New Roman" w:cs="Times New Roman"/>
           <w:sz w:val="22"/>
           <w:szCs w:val="22"/>
         </w:rPr>
@@ -938,6 +940,7 @@
       </w:r>
       <w:r>
         <w:rPr>
+          <w:rFonts w:ascii="Times New Roman" w:hAnsi="Times New Roman" w:cs="Times New Roman"/>
           <w:sz w:val="22"/>
           <w:szCs w:val="22"/>
         </w:rPr>
@@ -945,6 +948,7 @@
       </w:r>
       <w:r>
         <w:rPr>
+          <w:rFonts w:ascii="Times New Roman" w:hAnsi="Times New Roman" w:cs="Times New Roman"/>
           <w:sz w:val="22"/>
           <w:szCs w:val="22"/>
         </w:rPr>
@@ -952,6 +956,7 @@
       </w:r>
       <w:r>
         <w:rPr>
+          <w:rFonts w:ascii="Times New Roman" w:hAnsi="Times New Roman" w:cs="Times New Roman"/>
           <w:sz w:val="22"/>
           <w:szCs w:val="22"/>
         </w:rPr>
@@ -959,6 +964,7 @@
       </w:r>
       <w:r>
         <w:rPr>
+          <w:rFonts w:ascii="Times New Roman" w:hAnsi="Times New Roman" w:cs="Times New Roman"/>
           <w:sz w:val="22"/>
           <w:szCs w:val="22"/>
         </w:rPr>
@@ -973,12 +979,14 @@
           <w:numId w:val="12"/>
         </w:numPr>
         <w:rPr>
-          <w:sz w:val="22"/>
-          <w:szCs w:val="22"/>
-        </w:rPr>
-      </w:pPr>
-      <w:r>
-        <w:rPr>
+          <w:rFonts w:ascii="Times New Roman" w:hAnsi="Times New Roman" w:cs="Times New Roman"/>
+          <w:sz w:val="22"/>
+          <w:szCs w:val="22"/>
+        </w:rPr>
+      </w:pPr>
+      <w:r>
+        <w:rPr>
+          <w:rFonts w:ascii="Times New Roman" w:hAnsi="Times New Roman" w:cs="Times New Roman"/>
           <w:sz w:val="22"/>
           <w:szCs w:val="22"/>
         </w:rPr>
@@ -987,6 +995,7 @@
       </w:r>
       <w:r>
         <w:rPr>
+          <w:rFonts w:ascii="Times New Roman" w:hAnsi="Times New Roman" w:cs="Times New Roman"/>
           <w:sz w:val="22"/>
           <w:szCs w:val="22"/>
         </w:rPr>
@@ -994,6 +1003,7 @@
       </w:r>
       <w:r>
         <w:rPr>
+          <w:rFonts w:ascii="Times New Roman" w:hAnsi="Times New Roman" w:cs="Times New Roman"/>
           <w:sz w:val="22"/>
           <w:szCs w:val="22"/>
         </w:rPr>
@@ -1001,6 +1011,7 @@
       </w:r>
       <w:r>
         <w:rPr>
+          <w:rFonts w:ascii="Times New Roman" w:hAnsi="Times New Roman" w:cs="Times New Roman"/>
           <w:sz w:val="22"/>
           <w:szCs w:val="22"/>
         </w:rPr>
@@ -1008,6 +1019,7 @@
       </w:r>
       <w:r>
         <w:rPr>
+          <w:rFonts w:ascii="Times New Roman" w:hAnsi="Times New Roman" w:cs="Times New Roman"/>
           <w:sz w:val="22"/>
           <w:szCs w:val="22"/>
         </w:rPr>
@@ -1022,12 +1034,14 @@
           <w:numId w:val="12"/>
         </w:numPr>
         <w:rPr>
-          <w:sz w:val="22"/>
-          <w:szCs w:val="22"/>
-        </w:rPr>
-      </w:pPr>
-      <w:r>
-        <w:rPr>
+          <w:rFonts w:ascii="Times New Roman" w:hAnsi="Times New Roman" w:cs="Times New Roman"/>
+          <w:sz w:val="22"/>
+          <w:szCs w:val="22"/>
+        </w:rPr>
+      </w:pPr>
+      <w:r>
+        <w:rPr>
+          <w:rFonts w:ascii="Times New Roman" w:hAnsi="Times New Roman" w:cs="Times New Roman"/>
           <w:sz w:val="22"/>
           <w:szCs w:val="22"/>
         </w:rPr>
@@ -1035,6 +1049,7 @@
       </w:r>
       <w:r>
         <w:rPr>
+          <w:rFonts w:ascii="Times New Roman" w:hAnsi="Times New Roman" w:cs="Times New Roman"/>
           <w:sz w:val="22"/>
           <w:szCs w:val="22"/>
         </w:rPr>
@@ -1042,6 +1057,7 @@
       </w:r>
       <w:r>
         <w:rPr>
+          <w:rFonts w:ascii="Times New Roman" w:hAnsi="Times New Roman" w:cs="Times New Roman"/>
           <w:sz w:val="22"/>
           <w:szCs w:val="22"/>
         </w:rPr>
@@ -1056,12 +1072,14 @@
           <w:numId w:val="12"/>
         </w:numPr>
         <w:rPr>
-          <w:sz w:val="22"/>
-          <w:szCs w:val="22"/>
-        </w:rPr>
-      </w:pPr>
-      <w:r>
-        <w:rPr>
+          <w:rFonts w:ascii="Times New Roman" w:hAnsi="Times New Roman" w:cs="Times New Roman"/>
+          <w:sz w:val="22"/>
+          <w:szCs w:val="22"/>
+        </w:rPr>
+      </w:pPr>
+      <w:r>
+        <w:rPr>
+          <w:rFonts w:ascii="Times New Roman" w:hAnsi="Times New Roman" w:cs="Times New Roman"/>
           <w:sz w:val="22"/>
           <w:szCs w:val="22"/>
         </w:rPr>
@@ -1069,6 +1087,7 @@
       </w:r>
       <w:r>
         <w:rPr>
+          <w:rFonts w:ascii="Times New Roman" w:hAnsi="Times New Roman" w:cs="Times New Roman"/>
           <w:sz w:val="22"/>
           <w:szCs w:val="22"/>
         </w:rPr>
@@ -1076,6 +1095,7 @@
       </w:r>
       <w:r>
         <w:rPr>
+          <w:rFonts w:ascii="Times New Roman" w:hAnsi="Times New Roman" w:cs="Times New Roman"/>
           <w:sz w:val="22"/>
           <w:szCs w:val="22"/>
         </w:rPr>
@@ -1083,6 +1103,7 @@
       </w:r>
       <w:r>
         <w:rPr>
+          <w:rFonts w:ascii="Times New Roman" w:hAnsi="Times New Roman" w:cs="Times New Roman"/>
           <w:sz w:val="22"/>
           <w:szCs w:val="22"/>
         </w:rPr>
@@ -1090,6 +1111,7 @@
       </w:r>
       <w:r>
         <w:rPr>
+          <w:rFonts w:ascii="Times New Roman" w:hAnsi="Times New Roman" w:cs="Times New Roman"/>
           <w:sz w:val="22"/>
           <w:szCs w:val="22"/>
         </w:rPr>
@@ -1097,6 +1119,7 @@
       </w:r>
       <w:r>
         <w:rPr>
+          <w:rFonts w:ascii="Times New Roman" w:hAnsi="Times New Roman" w:cs="Times New Roman"/>
           <w:sz w:val="22"/>
           <w:szCs w:val="22"/>
         </w:rPr>
@@ -1104,6 +1127,7 @@
       </w:r>
       <w:r>
         <w:rPr>
+          <w:rFonts w:ascii="Times New Roman" w:hAnsi="Times New Roman" w:cs="Times New Roman"/>
           <w:sz w:val="22"/>
           <w:szCs w:val="22"/>
         </w:rPr>
@@ -1111,6 +1135,7 @@
       </w:r>
       <w:r>
         <w:rPr>
+          <w:rFonts w:ascii="Times New Roman" w:hAnsi="Times New Roman" w:cs="Times New Roman"/>
           <w:sz w:val="22"/>
           <w:szCs w:val="22"/>
         </w:rPr>
@@ -1169,12 +1194,14 @@
           <w:numId w:val="18"/>
         </w:numPr>
         <w:rPr>
-          <w:sz w:val="22"/>
-          <w:szCs w:val="22"/>
-        </w:rPr>
-      </w:pPr>
-      <w:r>
-        <w:rPr>
+          <w:rFonts w:ascii="Times New Roman" w:hAnsi="Times New Roman" w:cs="Times New Roman"/>
+          <w:sz w:val="22"/>
+          <w:szCs w:val="22"/>
+        </w:rPr>
+      </w:pPr>
+      <w:r>
+        <w:rPr>
+          <w:rFonts w:ascii="Times New Roman" w:hAnsi="Times New Roman" w:cs="Times New Roman"/>
           <w:sz w:val="22"/>
           <w:szCs w:val="22"/>
         </w:rPr>
@@ -1183,6 +1210,7 @@
       <w:r>
         <w:rPr>
           <w:rStyle w:val="FootnoteReference"/>
+          <w:rFonts w:ascii="Times New Roman" w:hAnsi="Times New Roman" w:cs="Times New Roman"/>
           <w:sz w:val="22"/>
           <w:szCs w:val="22"/>
         </w:rPr>
@@ -1197,12 +1225,14 @@
           <w:numId w:val="18"/>
         </w:numPr>
         <w:rPr>
-          <w:sz w:val="22"/>
-          <w:szCs w:val="22"/>
-        </w:rPr>
-      </w:pPr>
-      <w:r>
-        <w:rPr>
+          <w:rFonts w:ascii="Times New Roman" w:hAnsi="Times New Roman" w:cs="Times New Roman"/>
+          <w:sz w:val="22"/>
+          <w:szCs w:val="22"/>
+        </w:rPr>
+      </w:pPr>
+      <w:r>
+        <w:rPr>
+          <w:rFonts w:ascii="Times New Roman" w:hAnsi="Times New Roman" w:cs="Times New Roman"/>
           <w:sz w:val="22"/>
           <w:szCs w:val="22"/>
         </w:rPr>
@@ -1211,6 +1241,7 @@
       <w:r>
         <w:rPr>
           <w:rStyle w:val="FootnoteReference"/>
+          <w:rFonts w:ascii="Times New Roman" w:hAnsi="Times New Roman" w:cs="Times New Roman"/>
           <w:sz w:val="22"/>
           <w:szCs w:val="22"/>
         </w:rPr>
@@ -1225,12 +1256,14 @@
           <w:numId w:val="18"/>
         </w:numPr>
         <w:rPr>
-          <w:sz w:val="22"/>
-          <w:szCs w:val="22"/>
-        </w:rPr>
-      </w:pPr>
-      <w:r>
-        <w:rPr>
+          <w:rFonts w:ascii="Times New Roman" w:hAnsi="Times New Roman" w:cs="Times New Roman"/>
+          <w:sz w:val="22"/>
+          <w:szCs w:val="22"/>
+        </w:rPr>
+      </w:pPr>
+      <w:r>
+        <w:rPr>
+          <w:rFonts w:ascii="Times New Roman" w:hAnsi="Times New Roman" w:cs="Times New Roman"/>
           <w:sz w:val="22"/>
           <w:szCs w:val="22"/>
         </w:rPr>
@@ -1238,6 +1271,7 @@
       </w:r>
       <w:r>
         <w:rPr>
+          <w:rFonts w:ascii="Times New Roman" w:hAnsi="Times New Roman" w:cs="Times New Roman"/>
           <w:sz w:val="22"/>
           <w:szCs w:val="22"/>
         </w:rPr>
@@ -1246,6 +1280,7 @@
       <w:r>
         <w:rPr>
           <w:rStyle w:val="FootnoteReference"/>
+          <w:rFonts w:ascii="Times New Roman" w:hAnsi="Times New Roman" w:cs="Times New Roman"/>
           <w:sz w:val="22"/>
           <w:szCs w:val="22"/>
         </w:rPr>
@@ -1301,12 +1336,14 @@
     <w:p>
       <w:pPr>
         <w:rPr>
-          <w:sz w:val="22"/>
-          <w:szCs w:val="22"/>
-        </w:rPr>
-      </w:pPr>
-      <w:r>
-        <w:rPr>
+          <w:rFonts w:ascii="Times New Roman" w:hAnsi="Times New Roman" w:cs="Times New Roman"/>
+          <w:sz w:val="22"/>
+          <w:szCs w:val="22"/>
+        </w:rPr>
+      </w:pPr>
+      <w:r>
+        <w:rPr>
+          <w:rFonts w:ascii="Times New Roman" w:hAnsi="Times New Roman" w:cs="Times New Roman"/>
           <w:sz w:val="22"/>
           <w:szCs w:val="22"/>
         </w:rPr>
@@ -1314,6 +1351,7 @@
       </w:r>
       <w:r>
         <w:rPr>
+          <w:rFonts w:ascii="Times New Roman" w:hAnsi="Times New Roman" w:cs="Times New Roman"/>
           <w:sz w:val="22"/>
           <w:szCs w:val="22"/>
         </w:rPr>
@@ -1321,6 +1359,7 @@
       </w:r>
       <w:r>
         <w:rPr>
+          <w:rFonts w:ascii="Times New Roman" w:hAnsi="Times New Roman" w:cs="Times New Roman"/>
           <w:sz w:val="22"/>
           <w:szCs w:val="22"/>
         </w:rPr>
@@ -1328,6 +1367,7 @@
       </w:r>
       <w:r>
         <w:rPr>
+          <w:rFonts w:ascii="Times New Roman" w:hAnsi="Times New Roman" w:cs="Times New Roman"/>
           <w:sz w:val="22"/>
           <w:szCs w:val="22"/>
         </w:rPr>
@@ -1342,12 +1382,14 @@
           <w:numId w:val="21"/>
         </w:numPr>
         <w:rPr>
-          <w:sz w:val="22"/>
-          <w:szCs w:val="22"/>
-        </w:rPr>
-      </w:pPr>
-      <w:r>
-        <w:rPr>
+          <w:rFonts w:ascii="Times New Roman" w:hAnsi="Times New Roman" w:cs="Times New Roman"/>
+          <w:sz w:val="22"/>
+          <w:szCs w:val="22"/>
+        </w:rPr>
+      </w:pPr>
+      <w:r>
+        <w:rPr>
+          <w:rFonts w:ascii="Times New Roman" w:hAnsi="Times New Roman" w:cs="Times New Roman"/>
           <w:sz w:val="22"/>
           <w:szCs w:val="22"/>
         </w:rPr>
@@ -1355,6 +1397,7 @@
       </w:r>
       <w:r>
         <w:rPr>
+          <w:rFonts w:ascii="Times New Roman" w:hAnsi="Times New Roman" w:cs="Times New Roman"/>
           <w:sz w:val="22"/>
           <w:szCs w:val="22"/>
         </w:rPr>
@@ -1362,6 +1405,7 @@
       </w:r>
       <w:r>
         <w:rPr>
+          <w:rFonts w:ascii="Times New Roman" w:hAnsi="Times New Roman" w:cs="Times New Roman"/>
           <w:sz w:val="22"/>
           <w:szCs w:val="22"/>
         </w:rPr>
@@ -1369,6 +1413,7 @@
       </w:r>
       <w:r>
         <w:rPr>
+          <w:rFonts w:ascii="Times New Roman" w:hAnsi="Times New Roman" w:cs="Times New Roman"/>
           <w:sz w:val="22"/>
           <w:szCs w:val="22"/>
         </w:rPr>
@@ -1376,6 +1421,7 @@
       </w:r>
       <w:r>
         <w:rPr>
+          <w:rFonts w:ascii="Times New Roman" w:hAnsi="Times New Roman" w:cs="Times New Roman"/>
           <w:sz w:val="22"/>
           <w:szCs w:val="22"/>
         </w:rPr>
@@ -1390,6 +1436,7 @@
           <w:numId w:val="21"/>
         </w:numPr>
         <w:rPr>
+          <w:rFonts w:ascii="Times New Roman" w:hAnsi="Times New Roman" w:cs="Times New Roman"/>
           <w:sz w:val="22"/>
           <w:szCs w:val="22"/>
         </w:rPr>
@@ -1397,6 +1444,7 @@
       <w:proofErr w:type="spellStart"/>
       <w:r>
         <w:rPr>
+          <w:rFonts w:ascii="Times New Roman" w:hAnsi="Times New Roman" w:cs="Times New Roman"/>
           <w:sz w:val="22"/>
           <w:szCs w:val="22"/>
         </w:rPr>
@@ -1405,6 +1453,7 @@
       <w:proofErr w:type="spellEnd"/>
       <w:r>
         <w:rPr>
+          <w:rFonts w:ascii="Times New Roman" w:hAnsi="Times New Roman" w:cs="Times New Roman"/>
           <w:sz w:val="22"/>
           <w:szCs w:val="22"/>
         </w:rPr>
@@ -1412,6 +1461,7 @@
       </w:r>
       <w:r>
         <w:rPr>
+          <w:rFonts w:ascii="Times New Roman" w:hAnsi="Times New Roman" w:cs="Times New Roman"/>
           <w:sz w:val="22"/>
           <w:szCs w:val="22"/>
         </w:rPr>
@@ -1419,6 +1469,7 @@
       </w:r>
       <w:r>
         <w:rPr>
+          <w:rFonts w:ascii="Times New Roman" w:hAnsi="Times New Roman" w:cs="Times New Roman"/>
           <w:sz w:val="22"/>
           <w:szCs w:val="22"/>
         </w:rPr>
@@ -1433,12 +1484,14 @@
           <w:numId w:val="21"/>
         </w:numPr>
         <w:rPr>
-          <w:sz w:val="22"/>
-          <w:szCs w:val="22"/>
-        </w:rPr>
-      </w:pPr>
-      <w:r>
-        <w:rPr>
+          <w:rFonts w:ascii="Times New Roman" w:hAnsi="Times New Roman" w:cs="Times New Roman"/>
+          <w:sz w:val="22"/>
+          <w:szCs w:val="22"/>
+        </w:rPr>
+      </w:pPr>
+      <w:r>
+        <w:rPr>
+          <w:rFonts w:ascii="Times New Roman" w:hAnsi="Times New Roman" w:cs="Times New Roman"/>
           <w:sz w:val="22"/>
           <w:szCs w:val="22"/>
         </w:rPr>
@@ -1446,6 +1499,7 @@
       </w:r>
       <w:r>
         <w:rPr>
+          <w:rFonts w:ascii="Times New Roman" w:hAnsi="Times New Roman" w:cs="Times New Roman"/>
           <w:sz w:val="22"/>
           <w:szCs w:val="22"/>
         </w:rPr>
@@ -1453,6 +1507,7 @@
       </w:r>
       <w:r>
         <w:rPr>
+          <w:rFonts w:ascii="Times New Roman" w:hAnsi="Times New Roman" w:cs="Times New Roman"/>
           <w:sz w:val="22"/>
           <w:szCs w:val="22"/>
         </w:rPr>
@@ -1460,6 +1515,7 @@
       </w:r>
       <w:r>
         <w:rPr>
+          <w:rFonts w:ascii="Times New Roman" w:hAnsi="Times New Roman" w:cs="Times New Roman"/>
           <w:sz w:val="22"/>
           <w:szCs w:val="22"/>
         </w:rPr>
@@ -1504,12 +1560,14 @@
           <w:numId w:val="22"/>
         </w:numPr>
         <w:rPr>
-          <w:sz w:val="22"/>
-          <w:szCs w:val="22"/>
-        </w:rPr>
-      </w:pPr>
-      <w:r>
-        <w:rPr>
+          <w:rFonts w:ascii="Times New Roman" w:hAnsi="Times New Roman" w:cs="Times New Roman"/>
+          <w:sz w:val="22"/>
+          <w:szCs w:val="22"/>
+        </w:rPr>
+      </w:pPr>
+      <w:r>
+        <w:rPr>
+          <w:rFonts w:ascii="Times New Roman" w:hAnsi="Times New Roman" w:cs="Times New Roman"/>
           <w:sz w:val="22"/>
           <w:szCs w:val="22"/>
         </w:rPr>
@@ -1517,6 +1575,7 @@
       </w:r>
       <w:r>
         <w:rPr>
+          <w:rFonts w:ascii="Times New Roman" w:hAnsi="Times New Roman" w:cs="Times New Roman"/>
           <w:sz w:val="22"/>
           <w:szCs w:val="22"/>
         </w:rPr>
@@ -1524,6 +1583,7 @@
       </w:r>
       <w:r>
         <w:rPr>
+          <w:rFonts w:ascii="Times New Roman" w:hAnsi="Times New Roman" w:cs="Times New Roman"/>
           <w:sz w:val="22"/>
           <w:szCs w:val="22"/>
         </w:rPr>
@@ -1538,12 +1598,14 @@
           <w:numId w:val="22"/>
         </w:numPr>
         <w:rPr>
-          <w:sz w:val="22"/>
-          <w:szCs w:val="22"/>
-        </w:rPr>
-      </w:pPr>
-      <w:r>
-        <w:rPr>
+          <w:rFonts w:ascii="Times New Roman" w:hAnsi="Times New Roman" w:cs="Times New Roman"/>
+          <w:sz w:val="22"/>
+          <w:szCs w:val="22"/>
+        </w:rPr>
+      </w:pPr>
+      <w:r>
+        <w:rPr>
+          <w:rFonts w:ascii="Times New Roman" w:hAnsi="Times New Roman" w:cs="Times New Roman"/>
           <w:sz w:val="22"/>
           <w:szCs w:val="22"/>
         </w:rPr>
@@ -1552,6 +1614,7 @@
       <w:proofErr w:type="spellStart"/>
       <w:r>
         <w:rPr>
+          <w:rFonts w:ascii="Times New Roman" w:hAnsi="Times New Roman" w:cs="Times New Roman"/>
           <w:sz w:val="22"/>
           <w:szCs w:val="22"/>
         </w:rPr>
@@ -1560,6 +1623,7 @@
       <w:proofErr w:type="spellEnd"/>
       <w:r>
         <w:rPr>
+          <w:rFonts w:ascii="Times New Roman" w:hAnsi="Times New Roman" w:cs="Times New Roman"/>
           <w:sz w:val="22"/>
           <w:szCs w:val="22"/>
         </w:rPr>
@@ -1574,12 +1638,14 @@
           <w:numId w:val="22"/>
         </w:numPr>
         <w:rPr>
-          <w:sz w:val="22"/>
-          <w:szCs w:val="22"/>
-        </w:rPr>
-      </w:pPr>
-      <w:r>
-        <w:rPr>
+          <w:rFonts w:ascii="Times New Roman" w:hAnsi="Times New Roman" w:cs="Times New Roman"/>
+          <w:sz w:val="22"/>
+          <w:szCs w:val="22"/>
+        </w:rPr>
+      </w:pPr>
+      <w:r>
+        <w:rPr>
+          <w:rFonts w:ascii="Times New Roman" w:hAnsi="Times New Roman" w:cs="Times New Roman"/>
           <w:sz w:val="22"/>
           <w:szCs w:val="22"/>
         </w:rPr>
@@ -1587,6 +1653,7 @@
       </w:r>
       <w:r>
         <w:rPr>
+          <w:rFonts w:ascii="Times New Roman" w:hAnsi="Times New Roman" w:cs="Times New Roman"/>
           <w:sz w:val="22"/>
           <w:szCs w:val="22"/>
         </w:rPr>
@@ -1594,6 +1661,7 @@
       </w:r>
       <w:r>
         <w:rPr>
+          <w:rFonts w:ascii="Times New Roman" w:hAnsi="Times New Roman" w:cs="Times New Roman"/>
           <w:sz w:val="22"/>
           <w:szCs w:val="22"/>
         </w:rPr>
@@ -1601,6 +1669,7 @@
       </w:r>
       <w:r>
         <w:rPr>
+          <w:rFonts w:ascii="Times New Roman" w:hAnsi="Times New Roman" w:cs="Times New Roman"/>
           <w:sz w:val="22"/>
           <w:szCs w:val="22"/>
         </w:rPr>
@@ -1637,12 +1706,14 @@
           <w:numId w:val="28"/>
         </w:numPr>
         <w:rPr>
-          <w:sz w:val="22"/>
-          <w:szCs w:val="22"/>
-        </w:rPr>
-      </w:pPr>
-      <w:r>
-        <w:rPr>
+          <w:rFonts w:ascii="Times New Roman" w:hAnsi="Times New Roman" w:cs="Times New Roman"/>
+          <w:sz w:val="22"/>
+          <w:szCs w:val="22"/>
+        </w:rPr>
+      </w:pPr>
+      <w:r>
+        <w:rPr>
+          <w:rFonts w:ascii="Times New Roman" w:hAnsi="Times New Roman" w:cs="Times New Roman"/>
           <w:b/>
           <w:bCs/>
           <w:sz w:val="22"/>
@@ -1653,6 +1724,7 @@
       </w:r>
       <w:r>
         <w:rPr>
+          <w:rFonts w:ascii="Times New Roman" w:hAnsi="Times New Roman" w:cs="Times New Roman"/>
           <w:sz w:val="22"/>
           <w:szCs w:val="22"/>
         </w:rPr>
@@ -1660,6 +1732,7 @@
       </w:r>
       <w:r>
         <w:rPr>
+          <w:rFonts w:ascii="Times New Roman" w:hAnsi="Times New Roman" w:cs="Times New Roman"/>
           <w:sz w:val="22"/>
           <w:szCs w:val="22"/>
         </w:rPr>
@@ -1674,12 +1747,14 @@
           <w:numId w:val="28"/>
         </w:numPr>
         <w:rPr>
-          <w:sz w:val="22"/>
-          <w:szCs w:val="22"/>
-        </w:rPr>
-      </w:pPr>
-      <w:r>
-        <w:rPr>
+          <w:rFonts w:ascii="Times New Roman" w:hAnsi="Times New Roman" w:cs="Times New Roman"/>
+          <w:sz w:val="22"/>
+          <w:szCs w:val="22"/>
+        </w:rPr>
+      </w:pPr>
+      <w:r>
+        <w:rPr>
+          <w:rFonts w:ascii="Times New Roman" w:hAnsi="Times New Roman" w:cs="Times New Roman"/>
           <w:sz w:val="22"/>
           <w:szCs w:val="22"/>
         </w:rPr>
@@ -1687,6 +1762,7 @@
       </w:r>
       <w:r>
         <w:rPr>
+          <w:rFonts w:ascii="Times New Roman" w:hAnsi="Times New Roman" w:cs="Times New Roman"/>
           <w:sz w:val="22"/>
           <w:szCs w:val="22"/>
         </w:rPr>
@@ -1694,6 +1770,7 @@
       </w:r>
       <w:r>
         <w:rPr>
+          <w:rFonts w:ascii="Times New Roman" w:hAnsi="Times New Roman" w:cs="Times New Roman"/>
           <w:sz w:val="22"/>
           <w:szCs w:val="22"/>
         </w:rPr>
@@ -1708,20 +1785,22 @@
           <w:numId w:val="28"/>
         </w:numPr>
         <w:rPr>
-          <w:sz w:val="22"/>
-          <w:szCs w:val="22"/>
-        </w:rPr>
-      </w:pPr>
-      <w:r>
-        <w:rPr>
-          <w:sz w:val="22"/>
-          <w:szCs w:val="22"/>
-        </w:rPr>
-        <w:lastRenderedPageBreak/>
+          <w:rFonts w:ascii="Times New Roman" w:hAnsi="Times New Roman" w:cs="Times New Roman"/>
+          <w:sz w:val="22"/>
+          <w:szCs w:val="22"/>
+        </w:rPr>
+      </w:pPr>
+      <w:r>
+        <w:rPr>
+          <w:rFonts w:ascii="Times New Roman" w:hAnsi="Times New Roman" w:cs="Times New Roman"/>
+          <w:sz w:val="22"/>
+          <w:szCs w:val="22"/>
+        </w:rPr>
         <w:t xml:space="preserve">secondary tier of driver data such as age of driver, </w:t>
       </w:r>
       <w:r>
         <w:rPr>
+          <w:rFonts w:ascii="Times New Roman" w:hAnsi="Times New Roman" w:cs="Times New Roman"/>
           <w:sz w:val="22"/>
           <w:szCs w:val="22"/>
         </w:rPr>
@@ -1736,12 +1815,14 @@
           <w:numId w:val="28"/>
         </w:numPr>
         <w:rPr>
-          <w:sz w:val="22"/>
-          <w:szCs w:val="22"/>
-        </w:rPr>
-      </w:pPr>
-      <w:r>
-        <w:rPr>
+          <w:rFonts w:ascii="Times New Roman" w:hAnsi="Times New Roman" w:cs="Times New Roman"/>
+          <w:sz w:val="22"/>
+          <w:szCs w:val="22"/>
+        </w:rPr>
+      </w:pPr>
+      <w:r>
+        <w:rPr>
+          <w:rFonts w:ascii="Times New Roman" w:hAnsi="Times New Roman" w:cs="Times New Roman"/>
           <w:sz w:val="22"/>
           <w:szCs w:val="22"/>
         </w:rPr>
@@ -1749,6 +1830,7 @@
       </w:r>
       <w:r>
         <w:rPr>
+          <w:rFonts w:ascii="Times New Roman" w:hAnsi="Times New Roman" w:cs="Times New Roman"/>
           <w:sz w:val="22"/>
           <w:szCs w:val="22"/>
         </w:rPr>
@@ -1756,6 +1838,7 @@
       </w:r>
       <w:r>
         <w:rPr>
+          <w:rFonts w:ascii="Times New Roman" w:hAnsi="Times New Roman" w:cs="Times New Roman"/>
           <w:sz w:val="22"/>
           <w:szCs w:val="22"/>
         </w:rPr>
@@ -1770,12 +1853,14 @@
           <w:numId w:val="28"/>
         </w:numPr>
         <w:rPr>
-          <w:sz w:val="22"/>
-          <w:szCs w:val="22"/>
-        </w:rPr>
-      </w:pPr>
-      <w:r>
-        <w:rPr>
+          <w:rFonts w:ascii="Times New Roman" w:hAnsi="Times New Roman" w:cs="Times New Roman"/>
+          <w:sz w:val="22"/>
+          <w:szCs w:val="22"/>
+        </w:rPr>
+      </w:pPr>
+      <w:r>
+        <w:rPr>
+          <w:rFonts w:ascii="Times New Roman" w:hAnsi="Times New Roman" w:cs="Times New Roman"/>
           <w:sz w:val="22"/>
           <w:szCs w:val="22"/>
         </w:rPr>
@@ -1783,6 +1868,7 @@
       </w:r>
       <w:r>
         <w:rPr>
+          <w:rFonts w:ascii="Times New Roman" w:hAnsi="Times New Roman" w:cs="Times New Roman"/>
           <w:sz w:val="22"/>
           <w:szCs w:val="22"/>
         </w:rPr>
@@ -1790,6 +1876,7 @@
       </w:r>
       <w:r>
         <w:rPr>
+          <w:rFonts w:ascii="Times New Roman" w:hAnsi="Times New Roman" w:cs="Times New Roman"/>
           <w:sz w:val="22"/>
           <w:szCs w:val="22"/>
         </w:rPr>
@@ -1805,19 +1892,23 @@
         </w:numPr>
         <w:spacing w:after="240"/>
         <w:rPr>
-          <w:sz w:val="22"/>
-          <w:szCs w:val="22"/>
-        </w:rPr>
-      </w:pPr>
-      <w:r>
-        <w:rPr>
-          <w:sz w:val="22"/>
-          <w:szCs w:val="22"/>
-        </w:rPr>
+          <w:rFonts w:ascii="Times New Roman" w:hAnsi="Times New Roman" w:cs="Times New Roman"/>
+          <w:sz w:val="22"/>
+          <w:szCs w:val="22"/>
+        </w:rPr>
+      </w:pPr>
+      <w:r>
+        <w:rPr>
+          <w:rFonts w:ascii="Times New Roman" w:hAnsi="Times New Roman" w:cs="Times New Roman"/>
+          <w:sz w:val="22"/>
+          <w:szCs w:val="22"/>
+        </w:rPr>
+        <w:lastRenderedPageBreak/>
         <w:t xml:space="preserve">Supplementary tier consisting of </w:t>
       </w:r>
       <w:r>
         <w:rPr>
+          <w:rFonts w:ascii="Times New Roman" w:hAnsi="Times New Roman" w:cs="Times New Roman"/>
           <w:sz w:val="22"/>
           <w:szCs w:val="22"/>
         </w:rPr>
@@ -1833,12 +1924,14 @@
         </w:numPr>
         <w:spacing w:after="240"/>
         <w:rPr>
-          <w:sz w:val="22"/>
-          <w:szCs w:val="22"/>
-        </w:rPr>
-      </w:pPr>
-      <w:r>
-        <w:rPr>
+          <w:rFonts w:ascii="Times New Roman" w:hAnsi="Times New Roman" w:cs="Times New Roman"/>
+          <w:sz w:val="22"/>
+          <w:szCs w:val="22"/>
+        </w:rPr>
+      </w:pPr>
+      <w:r>
+        <w:rPr>
+          <w:rFonts w:ascii="Times New Roman" w:hAnsi="Times New Roman" w:cs="Times New Roman"/>
           <w:b/>
           <w:bCs/>
           <w:sz w:val="22"/>
@@ -1849,6 +1942,7 @@
       </w:r>
       <w:r>
         <w:rPr>
+          <w:rFonts w:ascii="Times New Roman" w:hAnsi="Times New Roman" w:cs="Times New Roman"/>
           <w:sz w:val="22"/>
           <w:szCs w:val="22"/>
         </w:rPr>
@@ -1856,6 +1950,7 @@
       </w:r>
       <w:r>
         <w:rPr>
+          <w:rFonts w:ascii="Times New Roman" w:hAnsi="Times New Roman" w:cs="Times New Roman"/>
           <w:sz w:val="22"/>
           <w:szCs w:val="22"/>
         </w:rPr>
@@ -1863,6 +1958,7 @@
       </w:r>
       <w:r>
         <w:rPr>
+          <w:rFonts w:ascii="Times New Roman" w:hAnsi="Times New Roman" w:cs="Times New Roman"/>
           <w:sz w:val="22"/>
           <w:szCs w:val="22"/>
         </w:rPr>
@@ -1870,6 +1966,7 @@
       </w:r>
       <w:r>
         <w:rPr>
+          <w:rFonts w:ascii="Times New Roman" w:hAnsi="Times New Roman" w:cs="Times New Roman"/>
           <w:sz w:val="22"/>
           <w:szCs w:val="22"/>
         </w:rPr>
@@ -1877,6 +1974,7 @@
       </w:r>
       <w:r>
         <w:rPr>
+          <w:rFonts w:ascii="Times New Roman" w:hAnsi="Times New Roman" w:cs="Times New Roman"/>
           <w:sz w:val="22"/>
           <w:szCs w:val="22"/>
         </w:rPr>
@@ -1884,6 +1982,7 @@
       </w:r>
       <w:r>
         <w:rPr>
+          <w:rFonts w:ascii="Times New Roman" w:hAnsi="Times New Roman" w:cs="Times New Roman"/>
           <w:sz w:val="22"/>
           <w:szCs w:val="22"/>
         </w:rPr>
@@ -1895,9 +1994,13 @@
         <w:pStyle w:val="FootnoteText"/>
         <w:keepNext/>
         <w:spacing w:after="240"/>
-      </w:pPr>
-      <w:r>
-        <w:rPr>
+        <w:rPr>
+          <w:rFonts w:ascii="Times New Roman" w:hAnsi="Times New Roman" w:cs="Times New Roman"/>
+        </w:rPr>
+      </w:pPr>
+      <w:r>
+        <w:rPr>
+          <w:rFonts w:ascii="Times New Roman" w:hAnsi="Times New Roman" w:cs="Times New Roman"/>
           <w:sz w:val="24"/>
           <w:szCs w:val="24"/>
         </w:rPr>
@@ -1951,35 +2054,63 @@
       <w:pPr>
         <w:pStyle w:val="Caption"/>
         <w:jc w:val="center"/>
-      </w:pPr>
-      <w:r>
+        <w:rPr>
+          <w:rFonts w:ascii="Times New Roman" w:hAnsi="Times New Roman" w:cs="Times New Roman"/>
+        </w:rPr>
+      </w:pPr>
+      <w:r>
+        <w:rPr>
+          <w:rFonts w:ascii="Times New Roman" w:hAnsi="Times New Roman" w:cs="Times New Roman"/>
+        </w:rPr>
         <w:t xml:space="preserve">Figure </w:t>
       </w:r>
       <w:r>
+        <w:rPr>
+          <w:rFonts w:ascii="Times New Roman" w:hAnsi="Times New Roman" w:cs="Times New Roman"/>
+        </w:rPr>
         <w:fldChar w:fldCharType="begin"/>
       </w:r>
       <w:r>
+        <w:rPr>
+          <w:rFonts w:ascii="Times New Roman" w:hAnsi="Times New Roman" w:cs="Times New Roman"/>
+        </w:rPr>
         <w:instrText xml:space="preserve"> SEQ Figure \* ARABIC </w:instrText>
       </w:r>
       <w:r>
+        <w:rPr>
+          <w:rFonts w:ascii="Times New Roman" w:hAnsi="Times New Roman" w:cs="Times New Roman"/>
+        </w:rPr>
         <w:fldChar w:fldCharType="separate"/>
       </w:r>
       <w:r>
         <w:rPr>
+          <w:rFonts w:ascii="Times New Roman" w:hAnsi="Times New Roman" w:cs="Times New Roman"/>
           <w:noProof/>
         </w:rPr>
         <w:t>1</w:t>
       </w:r>
       <w:r>
+        <w:rPr>
+          <w:rFonts w:ascii="Times New Roman" w:hAnsi="Times New Roman" w:cs="Times New Roman"/>
+        </w:rPr>
         <w:fldChar w:fldCharType="end"/>
       </w:r>
       <w:r>
+        <w:rPr>
+          <w:rFonts w:ascii="Times New Roman" w:hAnsi="Times New Roman" w:cs="Times New Roman"/>
+        </w:rPr>
         <w:t xml:space="preserve"> </w:t>
       </w:r>
       <w:r>
+        <w:rPr>
+          <w:rFonts w:ascii="Times New Roman" w:hAnsi="Times New Roman" w:cs="Times New Roman"/>
+        </w:rPr>
         <w:t>–</w:t>
       </w:r>
       <w:r>
+        <w:rPr>
+          <w:rFonts w:ascii="Times New Roman" w:hAnsi="Times New Roman" w:cs="Times New Roman"/>
+        </w:rPr>
         <w:t xml:space="preserve"> Solution Workflow</w:t>
       </w:r>
     </w:p>
@@ -1991,12 +2122,14 @@
           <w:numId w:val="28"/>
         </w:numPr>
         <w:rPr>
-          <w:sz w:val="22"/>
-          <w:szCs w:val="22"/>
-        </w:rPr>
-      </w:pPr>
-      <w:r>
-        <w:rPr>
+          <w:rFonts w:ascii="Times New Roman" w:hAnsi="Times New Roman" w:cs="Times New Roman"/>
+          <w:sz w:val="22"/>
+          <w:szCs w:val="22"/>
+        </w:rPr>
+      </w:pPr>
+      <w:r>
+        <w:rPr>
+          <w:rFonts w:ascii="Times New Roman" w:hAnsi="Times New Roman" w:cs="Times New Roman"/>
           <w:b/>
           <w:bCs/>
           <w:sz w:val="22"/>
@@ -2007,6 +2140,7 @@
       </w:r>
       <w:r>
         <w:rPr>
+          <w:rFonts w:ascii="Times New Roman" w:hAnsi="Times New Roman" w:cs="Times New Roman"/>
           <w:sz w:val="22"/>
           <w:szCs w:val="22"/>
         </w:rPr>
@@ -2014,6 +2148,7 @@
       </w:r>
       <w:r>
         <w:rPr>
+          <w:rFonts w:ascii="Times New Roman" w:hAnsi="Times New Roman" w:cs="Times New Roman"/>
           <w:sz w:val="22"/>
           <w:szCs w:val="22"/>
         </w:rPr>
@@ -2021,6 +2156,7 @@
       </w:r>
       <w:r>
         <w:rPr>
+          <w:rFonts w:ascii="Times New Roman" w:hAnsi="Times New Roman" w:cs="Times New Roman"/>
           <w:sz w:val="22"/>
           <w:szCs w:val="22"/>
         </w:rPr>
@@ -2028,6 +2164,7 @@
       </w:r>
       <w:r>
         <w:rPr>
+          <w:rFonts w:ascii="Times New Roman" w:hAnsi="Times New Roman" w:cs="Times New Roman"/>
           <w:sz w:val="22"/>
           <w:szCs w:val="22"/>
         </w:rPr>
@@ -2035,6 +2172,7 @@
       </w:r>
       <w:r>
         <w:rPr>
+          <w:rFonts w:ascii="Times New Roman" w:hAnsi="Times New Roman" w:cs="Times New Roman"/>
           <w:sz w:val="22"/>
           <w:szCs w:val="22"/>
         </w:rPr>
@@ -2066,12 +2204,14 @@
     <w:p>
       <w:pPr>
         <w:rPr>
-          <w:sz w:val="22"/>
-          <w:szCs w:val="22"/>
-        </w:rPr>
-      </w:pPr>
-      <w:r>
-        <w:rPr>
+          <w:rFonts w:ascii="Times New Roman" w:hAnsi="Times New Roman" w:cs="Times New Roman"/>
+          <w:sz w:val="22"/>
+          <w:szCs w:val="22"/>
+        </w:rPr>
+      </w:pPr>
+      <w:r>
+        <w:rPr>
+          <w:rFonts w:ascii="Times New Roman" w:hAnsi="Times New Roman" w:cs="Times New Roman"/>
           <w:sz w:val="22"/>
           <w:szCs w:val="22"/>
         </w:rPr>
@@ -2142,12 +2282,14 @@
           <w:numId w:val="33"/>
         </w:numPr>
         <w:rPr>
-          <w:sz w:val="22"/>
-          <w:szCs w:val="22"/>
-        </w:rPr>
-      </w:pPr>
-      <w:r>
-        <w:rPr>
+          <w:rFonts w:ascii="Times New Roman" w:hAnsi="Times New Roman" w:cs="Times New Roman"/>
+          <w:sz w:val="22"/>
+          <w:szCs w:val="22"/>
+        </w:rPr>
+      </w:pPr>
+      <w:r>
+        <w:rPr>
+          <w:rFonts w:ascii="Times New Roman" w:hAnsi="Times New Roman" w:cs="Times New Roman"/>
           <w:sz w:val="22"/>
           <w:szCs w:val="22"/>
         </w:rPr>
@@ -2162,12 +2304,14 @@
           <w:numId w:val="33"/>
         </w:numPr>
         <w:rPr>
-          <w:sz w:val="22"/>
-          <w:szCs w:val="22"/>
-        </w:rPr>
-      </w:pPr>
-      <w:r>
-        <w:rPr>
+          <w:rFonts w:ascii="Times New Roman" w:hAnsi="Times New Roman" w:cs="Times New Roman"/>
+          <w:sz w:val="22"/>
+          <w:szCs w:val="22"/>
+        </w:rPr>
+      </w:pPr>
+      <w:r>
+        <w:rPr>
+          <w:rFonts w:ascii="Times New Roman" w:hAnsi="Times New Roman" w:cs="Times New Roman"/>
           <w:sz w:val="22"/>
           <w:szCs w:val="22"/>
         </w:rPr>
@@ -2182,12 +2326,14 @@
           <w:numId w:val="33"/>
         </w:numPr>
         <w:rPr>
-          <w:sz w:val="22"/>
-          <w:szCs w:val="22"/>
-        </w:rPr>
-      </w:pPr>
-      <w:r>
-        <w:rPr>
+          <w:rFonts w:ascii="Times New Roman" w:hAnsi="Times New Roman" w:cs="Times New Roman"/>
+          <w:sz w:val="22"/>
+          <w:szCs w:val="22"/>
+        </w:rPr>
+      </w:pPr>
+      <w:r>
+        <w:rPr>
+          <w:rFonts w:ascii="Times New Roman" w:hAnsi="Times New Roman" w:cs="Times New Roman"/>
           <w:sz w:val="22"/>
           <w:szCs w:val="22"/>
         </w:rPr>
@@ -2202,12 +2348,14 @@
           <w:numId w:val="33"/>
         </w:numPr>
         <w:rPr>
-          <w:sz w:val="22"/>
-          <w:szCs w:val="22"/>
-        </w:rPr>
-      </w:pPr>
-      <w:r>
-        <w:rPr>
+          <w:rFonts w:ascii="Times New Roman" w:hAnsi="Times New Roman" w:cs="Times New Roman"/>
+          <w:sz w:val="22"/>
+          <w:szCs w:val="22"/>
+        </w:rPr>
+      </w:pPr>
+      <w:r>
+        <w:rPr>
+          <w:rFonts w:ascii="Times New Roman" w:hAnsi="Times New Roman" w:cs="Times New Roman"/>
           <w:sz w:val="22"/>
           <w:szCs w:val="22"/>
         </w:rPr>
@@ -2222,12 +2370,14 @@
           <w:numId w:val="33"/>
         </w:numPr>
         <w:rPr>
-          <w:sz w:val="22"/>
-          <w:szCs w:val="22"/>
-        </w:rPr>
-      </w:pPr>
-      <w:r>
-        <w:rPr>
+          <w:rFonts w:ascii="Times New Roman" w:hAnsi="Times New Roman" w:cs="Times New Roman"/>
+          <w:sz w:val="22"/>
+          <w:szCs w:val="22"/>
+        </w:rPr>
+      </w:pPr>
+      <w:r>
+        <w:rPr>
+          <w:rFonts w:ascii="Times New Roman" w:hAnsi="Times New Roman" w:cs="Times New Roman"/>
           <w:sz w:val="22"/>
           <w:szCs w:val="22"/>
         </w:rPr>
@@ -2242,12 +2392,14 @@
           <w:numId w:val="33"/>
         </w:numPr>
         <w:rPr>
-          <w:sz w:val="22"/>
-          <w:szCs w:val="22"/>
-        </w:rPr>
-      </w:pPr>
-      <w:r>
-        <w:rPr>
+          <w:rFonts w:ascii="Times New Roman" w:hAnsi="Times New Roman" w:cs="Times New Roman"/>
+          <w:sz w:val="22"/>
+          <w:szCs w:val="22"/>
+        </w:rPr>
+      </w:pPr>
+      <w:r>
+        <w:rPr>
+          <w:rFonts w:ascii="Times New Roman" w:hAnsi="Times New Roman" w:cs="Times New Roman"/>
           <w:sz w:val="22"/>
           <w:szCs w:val="22"/>
         </w:rPr>
@@ -2390,6 +2542,7 @@
       <w:pStyle w:val="Header"/>
       <w:jc w:val="center"/>
       <w:rPr>
+        <w:rFonts w:ascii="Times New Roman" w:hAnsi="Times New Roman" w:cs="Times New Roman"/>
         <w:i/>
         <w:iCs/>
         <w:sz w:val="28"/>
@@ -2398,6 +2551,7 @@
     </w:pPr>
     <w:r>
       <w:rPr>
+        <w:rFonts w:ascii="Times New Roman" w:hAnsi="Times New Roman" w:cs="Times New Roman"/>
         <w:i/>
         <w:iCs/>
         <w:sz w:val="28"/>
@@ -2407,6 +2561,7 @@
     </w:r>
     <w:r>
       <w:rPr>
+        <w:rFonts w:ascii="Times New Roman" w:hAnsi="Times New Roman" w:cs="Times New Roman"/>
         <w:i/>
         <w:iCs/>
         <w:sz w:val="28"/>
@@ -5573,7 +5728,7 @@
 </file>
 
 <file path=customXml/itemProps1.xml><?xml version="1.0" encoding="utf-8"?>
-<ds:datastoreItem xmlns:ds="http://schemas.openxmlformats.org/officeDocument/2006/customXml" ds:itemID="{BB9DC7C9-C4AB-1D4C-8421-6A5376F64A60}">
+<ds:datastoreItem xmlns:ds="http://schemas.openxmlformats.org/officeDocument/2006/customXml" ds:itemID="{24592649-BE3C-6C4C-B529-81845193A335}">
   <ds:schemaRefs>
     <ds:schemaRef ds:uri="http://schemas.openxmlformats.org/officeDocument/2006/bibliography"/>
   </ds:schemaRefs>

</xml_diff>